<commit_message>
Keep Mercury progress alive in background
</commit_message>
<xml_diff>
--- a/demo/plantillas/Brothers/6_CARTA APERTURA CUENTA NOMINA BROTHERS.docx
+++ b/demo/plantillas/Brothers/6_CARTA APERTURA CUENTA NOMINA BROTHERS.docx
@@ -255,7 +255,21 @@
           <w:b/>
           <w:lang w:val="es-ES"/>
         </w:rPr>
-        <w:t>BROTHER AND INVESTMENTS</w:t>
+        <w:t>BROTHER</w:t>
+      </w:r>
+      <w:r>
+        <w:rPr>
+          <w:b/>
+          <w:lang w:val="es-ES"/>
+        </w:rPr>
+        <w:t>S</w:t>
+      </w:r>
+      <w:r>
+        <w:rPr>
+          <w:b/>
+          <w:lang w:val="es-ES"/>
+        </w:rPr>
+        <w:t xml:space="preserve"> AND INVESTMENTS</w:t>
       </w:r>
       <w:r>
         <w:rPr>
@@ -268,67 +282,31 @@
         <w:rPr>
           <w:lang w:val="es-ES"/>
         </w:rPr>
-        <w:t xml:space="preserve">autoriza al Banco BHD a realizar la apertura de cuenta con fines de pago de nómina empresarial de </w:t>
-      </w:r>
-      <w:proofErr w:type="spellStart"/>
-      <w:r>
-        <w:rPr>
-          <w:lang w:val="es-ES"/>
-        </w:rPr>
-        <w:t>nuestr</w:t>
-      </w:r>
-      <w:proofErr w:type="spellEnd"/>
+        <w:t>autoriza al Banco BHD a realizar la apertura de cuenta con fines de pago de nómina empresarial de nuestr</w:t>
+      </w:r>
       <w:r>
         <w:rPr>
           <w:lang w:val="es-DO"/>
         </w:rPr>
-        <w:t>{{</w:t>
-      </w:r>
-      <w:proofErr w:type="spellStart"/>
+        <w:t>{{Sexo|genero}}</w:t>
+      </w:r>
+      <w:r>
+        <w:rPr>
+          <w:lang w:val="es-ES"/>
+        </w:rPr>
+        <w:t xml:space="preserve"> </w:t>
+      </w:r>
+      <w:r>
+        <w:rPr>
+          <w:lang w:val="es-ES"/>
+        </w:rPr>
+        <w:t>emplead</w:t>
+      </w:r>
       <w:r>
         <w:rPr>
           <w:lang w:val="es-DO"/>
         </w:rPr>
-        <w:t>Sexo|genero</w:t>
-      </w:r>
-      <w:proofErr w:type="spellEnd"/>
-      <w:r>
-        <w:rPr>
-          <w:lang w:val="es-DO"/>
-        </w:rPr>
-        <w:t>}}</w:t>
-      </w:r>
-      <w:r>
-        <w:rPr>
-          <w:lang w:val="es-ES"/>
-        </w:rPr>
-        <w:t xml:space="preserve"> </w:t>
-      </w:r>
-      <w:r>
-        <w:rPr>
-          <w:lang w:val="es-ES"/>
-        </w:rPr>
-        <w:t>emplead</w:t>
-      </w:r>
-      <w:r>
-        <w:rPr>
-          <w:lang w:val="es-DO"/>
-        </w:rPr>
-        <w:t>{{</w:t>
-      </w:r>
-      <w:proofErr w:type="spellStart"/>
-      <w:r>
-        <w:rPr>
-          <w:lang w:val="es-DO"/>
-        </w:rPr>
-        <w:t>Sexo|genero</w:t>
-      </w:r>
-      <w:proofErr w:type="spellEnd"/>
-      <w:r>
-        <w:rPr>
-          <w:lang w:val="es-DO"/>
-        </w:rPr>
-        <w:t>}}</w:t>
+        <w:t>{{Sexo|genero}}</w:t>
       </w:r>
       <w:r>
         <w:rPr>
@@ -357,7 +335,6 @@
         </w:rPr>
         <w:t xml:space="preserve"> </w:t>
       </w:r>
-      <w:proofErr w:type="spellStart"/>
       <w:r>
         <w:rPr>
           <w:rFonts w:cs="Calibri"/>
@@ -365,9 +342,8 @@
           <w:bCs/>
           <w:lang w:val="es-DO"/>
         </w:rPr>
-        <w:t>Ced</w:t>
-      </w:r>
-      <w:proofErr w:type="spellEnd"/>
+        <w:t xml:space="preserve">Ced. No. </w:t>
+      </w:r>
       <w:r>
         <w:rPr>
           <w:rFonts w:cs="Calibri"/>
@@ -375,7 +351,7 @@
           <w:bCs/>
           <w:lang w:val="es-DO"/>
         </w:rPr>
-        <w:t xml:space="preserve">. No. </w:t>
+        <w:t>{{Cedula}}</w:t>
       </w:r>
       <w:r>
         <w:rPr>
@@ -384,95 +360,78 @@
           <w:bCs/>
           <w:lang w:val="es-DO"/>
         </w:rPr>
-        <w:t>{{Cedula}}</w:t>
-      </w:r>
-      <w:r>
-        <w:rPr>
-          <w:rFonts w:cs="Calibri"/>
-          <w:b/>
-          <w:bCs/>
+        <w:t xml:space="preserve"> </w:t>
+      </w:r>
+      <w:r>
+        <w:rPr>
+          <w:lang w:val="es-ES"/>
+        </w:rPr>
+        <w:t xml:space="preserve">en fecha </w:t>
+      </w:r>
+      <w:r>
+        <w:rPr>
+          <w:lang w:val="es-ES"/>
+        </w:rPr>
+        <w:t>{{Fecha Ingreso</w:t>
+      </w:r>
+      <w:r>
+        <w:rPr>
+          <w:lang w:val="es-ES"/>
+        </w:rPr>
+        <w:t>|date</w:t>
+      </w:r>
+      <w:r>
+        <w:rPr>
+          <w:lang w:val="es-ES"/>
+        </w:rPr>
+        <w:t>}}</w:t>
+      </w:r>
+      <w:r>
+        <w:rPr>
+          <w:lang w:val="es-ES"/>
+        </w:rPr>
+        <w:t xml:space="preserve"> o</w:t>
+      </w:r>
+      <w:r>
+        <w:rPr>
+          <w:lang w:val="es-ES"/>
+        </w:rPr>
+        <w:t>cupa</w:t>
+      </w:r>
+      <w:r>
+        <w:rPr>
+          <w:lang w:val="es-ES"/>
+        </w:rPr>
+        <w:t>n</w:t>
+      </w:r>
+      <w:r>
+        <w:rPr>
+          <w:lang w:val="es-ES"/>
+        </w:rPr>
+        <w:t xml:space="preserve">do el cargo de </w:t>
+      </w:r>
+      <w:r>
+        <w:rPr>
           <w:lang w:val="es-DO"/>
         </w:rPr>
+        <w:t>{{Posición}}</w:t>
+      </w:r>
+      <w:r>
+        <w:rPr>
+          <w:lang w:val="es-ES"/>
+        </w:rPr>
+        <w:t>,</w:t>
+      </w:r>
+      <w:r>
+        <w:rPr>
+          <w:lang w:val="es-ES"/>
+        </w:rPr>
         <w:t xml:space="preserve"> </w:t>
       </w:r>
       <w:r>
         <w:rPr>
           <w:lang w:val="es-ES"/>
         </w:rPr>
-        <w:t xml:space="preserve">en fecha </w:t>
-      </w:r>
-      <w:r>
-        <w:rPr>
-          <w:lang w:val="es-ES"/>
-        </w:rPr>
-        <w:t xml:space="preserve">{{Fecha </w:t>
-      </w:r>
-      <w:proofErr w:type="spellStart"/>
-      <w:r>
-        <w:rPr>
-          <w:lang w:val="es-ES"/>
-        </w:rPr>
-        <w:t>Ingreso</w:t>
-      </w:r>
-      <w:r>
-        <w:rPr>
-          <w:lang w:val="es-ES"/>
-        </w:rPr>
-        <w:t>|date</w:t>
-      </w:r>
-      <w:proofErr w:type="spellEnd"/>
-      <w:r>
-        <w:rPr>
-          <w:lang w:val="es-ES"/>
-        </w:rPr>
-        <w:t>}}</w:t>
-      </w:r>
-      <w:r>
-        <w:rPr>
-          <w:lang w:val="es-ES"/>
-        </w:rPr>
-        <w:t xml:space="preserve"> o</w:t>
-      </w:r>
-      <w:r>
-        <w:rPr>
-          <w:lang w:val="es-ES"/>
-        </w:rPr>
-        <w:t>cupa</w:t>
-      </w:r>
-      <w:r>
-        <w:rPr>
-          <w:lang w:val="es-ES"/>
-        </w:rPr>
-        <w:t>n</w:t>
-      </w:r>
-      <w:r>
-        <w:rPr>
-          <w:lang w:val="es-ES"/>
-        </w:rPr>
-        <w:t xml:space="preserve">do el cargo de </w:t>
-      </w:r>
-      <w:r>
-        <w:rPr>
-          <w:lang w:val="es-DO"/>
-        </w:rPr>
-        <w:t>{{Posición}}</w:t>
-      </w:r>
-      <w:r>
-        <w:rPr>
-          <w:lang w:val="es-ES"/>
-        </w:rPr>
-        <w:t>,</w:t>
-      </w:r>
-      <w:r>
-        <w:rPr>
-          <w:lang w:val="es-ES"/>
-        </w:rPr>
-        <w:t xml:space="preserve"> </w:t>
-      </w:r>
-      <w:r>
-        <w:rPr>
-          <w:lang w:val="es-ES"/>
-        </w:rPr>
         <w:t>actividad</w:t>
       </w:r>
       <w:r>
@@ -493,15 +452,7 @@
           <w:b/>
           <w:lang w:val="es-ES"/>
         </w:rPr>
-        <w:t xml:space="preserve">{{Salario </w:t>
-      </w:r>
-      <w:proofErr w:type="spellStart"/>
-      <w:r>
-        <w:rPr>
-          <w:b/>
-          <w:lang w:val="es-ES"/>
-        </w:rPr>
-        <w:t>Base</w:t>
+        <w:t>{{Salario Base</w:t>
       </w:r>
       <w:r>
         <w:rPr>
@@ -510,7 +461,6 @@
         </w:rPr>
         <w:t>|money</w:t>
       </w:r>
-      <w:proofErr w:type="spellEnd"/>
       <w:r>
         <w:rPr>
           <w:b/>
@@ -748,23 +698,7 @@
         <w:sz w:val="20"/>
         <w:szCs w:val="20"/>
       </w:rPr>
-      <w:t xml:space="preserve">C/ Erick Leonard No. 37, Suite 201, Arrollo Hondo, Sto </w:t>
-    </w:r>
-    <w:proofErr w:type="spellStart"/>
-    <w:r>
-      <w:rPr>
-        <w:sz w:val="20"/>
-        <w:szCs w:val="20"/>
-      </w:rPr>
-      <w:t>Dgo</w:t>
-    </w:r>
-    <w:proofErr w:type="spellEnd"/>
-    <w:r>
-      <w:rPr>
-        <w:sz w:val="20"/>
-        <w:szCs w:val="20"/>
-      </w:rPr>
-      <w:t>. Rep. Dom.</w:t>
+      <w:t>C/ Erick Leonard No. 37, Suite 201, Arrollo Hondo, Sto Dgo. Rep. Dom.</w:t>
     </w:r>
   </w:p>
   <w:p>

</xml_diff>